<commit_message>
add more items to the TBDW doc
</commit_message>
<xml_diff>
--- a/to-be-dealt-with.docx
+++ b/to-be-dealt-with.docx
@@ -9388,6 +9388,12 @@
                 <w:rFonts w:asciiTheme="majorBidi" w:hAnsiTheme="majorBidi" w:cstheme="majorBidi"/>
               </w:rPr>
             </w:pPr>
+            <w:r>
+              <w:rPr>
+                <w:rFonts w:asciiTheme="majorBidi" w:hAnsiTheme="majorBidi" w:cstheme="majorBidi"/>
+              </w:rPr>
+              <w:t>The mediator, observer, and decorator patterns</w:t>
+            </w:r>
           </w:p>
         </w:tc>
         <w:tc>
@@ -9418,6 +9424,12 @@
                 <w:rFonts w:asciiTheme="majorBidi" w:hAnsiTheme="majorBidi" w:cstheme="majorBidi"/>
               </w:rPr>
             </w:pPr>
+            <w:r>
+              <w:rPr>
+                <w:rFonts w:asciiTheme="majorBidi" w:hAnsiTheme="majorBidi" w:cstheme="majorBidi"/>
+              </w:rPr>
+              <w:t>Bitwise in java</w:t>
+            </w:r>
           </w:p>
         </w:tc>
         <w:tc>
@@ -9445,6 +9457,12 @@
                 <w:rFonts w:asciiTheme="majorBidi" w:hAnsiTheme="majorBidi" w:cstheme="majorBidi"/>
               </w:rPr>
             </w:pPr>
+            <w:r>
+              <w:rPr>
+                <w:rFonts w:asciiTheme="majorBidi" w:hAnsiTheme="majorBidi" w:cstheme="majorBidi"/>
+              </w:rPr>
+              <w:t>Streams venkat</w:t>
+            </w:r>
           </w:p>
         </w:tc>
         <w:tc>

</xml_diff>